<commit_message>
feat: add delete lead button in admin dashboard for Buyer's Guide leads
- Added deleteDossierLead() in auth-service.js (demo + Firestore)
- Added delete button (🗑️) next to assign button in leads table
- Added confirmation modal with bilingual text (EN/ES)
- confirmDeleteLead() removes lead, updates stat counter, refreshes table
- Exported handleDeleteLead and confirmDeleteLead in admin-views API
</commit_message>
<xml_diff>
--- a/USA - Spain /Referral_Agreement_Template.docx
+++ b/USA - Spain /Referral_Agreement_Template.docx
@@ -82,9 +82,7 @@
                 <w:color w:val="212529"/>
                 <w:sz w:val="28"/>
               </w:rPr>
-              <w:t>Referral Agreement</w:t>
-              <w:br/>
-              <w:t>Acuerdo de Referido</w:t>
+              <w:t>Master Referral Agreement</w:t>
             </w:r>
           </w:p>
           <w:p>
@@ -94,9 +92,9 @@
             <w:r>
               <w:rPr>
                 <w:color w:val="6C757D"/>
-                <w:sz w:val="16"/>
+                <w:sz w:val="18"/>
               </w:rPr>
-              <w:t>B2B Broker-to-Broker / Colaboración de Corredor a Corredor</w:t>
+              <w:t>Acuerdo Marco de Colaboración y Referidos</w:t>
             </w:r>
           </w:p>
         </w:tc>
@@ -311,7 +309,7 @@
                 <w:color w:val="212529"/>
                 <w:sz w:val="18"/>
               </w:rPr>
-              <w:t>Referring Agent / Agente Referente:</w:t>
+              <w:t>Contact Email / Correo:</w:t>
             </w:r>
           </w:p>
         </w:tc>
@@ -343,39 +341,7 @@
                 <w:color w:val="212529"/>
                 <w:sz w:val="18"/>
               </w:rPr>
-              <w:t>Agent License # / Licencia Agente:</w:t>
-            </w:r>
-          </w:p>
-        </w:tc>
-        <w:tc>
-          <w:tcPr>
-            <w:tcW w:type="dxa" w:w="6192"/>
-            <w:shd w:fill="F8F9FA"/>
-          </w:tcPr>
-          <w:p>
-            <w:r>
-              <w:rPr>
-                <w:color w:val="212529"/>
-                <w:sz w:val="18"/>
-              </w:rPr>
-            </w:r>
-          </w:p>
-        </w:tc>
-      </w:tr>
-      <w:tr>
-        <w:tc>
-          <w:tcPr>
-            <w:tcW w:type="dxa" w:w="3168"/>
-            <w:shd w:fill="F8F9FA"/>
-          </w:tcPr>
-          <w:p>
-            <w:r>
-              <w:rPr>
-                <w:b/>
-                <w:color w:val="212529"/>
-                <w:sz w:val="18"/>
-              </w:rPr>
-              <w:t>Agent Contact / Contacto:</w:t>
+              <w:t>Contact Phone / Teléfono:</w:t>
             </w:r>
           </w:p>
         </w:tc>
@@ -630,232 +596,18 @@
           </w:p>
         </w:tc>
       </w:tr>
-      <w:tr>
-        <w:tc>
-          <w:tcPr>
-            <w:tcW w:type="dxa" w:w="3168"/>
-            <w:shd w:fill="F8F9FA"/>
-          </w:tcPr>
-          <w:p>
-            <w:r>
-              <w:rPr>
-                <w:b/>
-                <w:color w:val="212529"/>
-                <w:sz w:val="18"/>
-              </w:rPr>
-              <w:t>Local Agent / Agente Local España:</w:t>
-            </w:r>
-          </w:p>
-        </w:tc>
-        <w:tc>
-          <w:tcPr>
-            <w:tcW w:type="dxa" w:w="6192"/>
-            <w:shd w:fill="F8F9FA"/>
-          </w:tcPr>
-          <w:p>
-            <w:r>
-              <w:rPr>
-                <w:color w:val="212529"/>
-                <w:sz w:val="18"/>
-              </w:rPr>
-            </w:r>
-          </w:p>
-        </w:tc>
-      </w:tr>
     </w:tbl>
     <w:p>
       <w:pPr>
-        <w:spacing w:before="240" w:after="80"/>
+        <w:spacing w:before="200" w:after="40"/>
       </w:pPr>
       <w:r>
         <w:rPr>
           <w:b/>
           <w:color w:val="003DA5"/>
-          <w:sz w:val="22"/>
+          <w:sz w:val="20"/>
         </w:rPr>
-        <w:t>PROSPECT — Referred Buyer Client</w:t>
-      </w:r>
-      <w:r>
-        <w:rPr>
-          <w:color w:val="6C757D"/>
-          <w:sz w:val="22"/>
-        </w:rPr>
-        <w:t xml:space="preserve"> / </w:t>
-      </w:r>
-      <w:r>
-        <w:rPr>
-          <w:b/>
-          <w:color w:val="E11B22"/>
-          <w:sz w:val="22"/>
-        </w:rPr>
-        <w:t>CLIENTE REFERIDO — Comprador</w:t>
-      </w:r>
-    </w:p>
-    <w:tbl>
-      <w:tblPr>
-        <w:tblW w:type="auto" w:w="0"/>
-        <w:tblLook w:firstColumn="1" w:firstRow="1" w:lastColumn="0" w:lastRow="0" w:noHBand="0" w:noVBand="1" w:val="04A0"/>
-      </w:tblPr>
-      <w:tblGrid>
-        <w:gridCol w:w="3168"/>
-        <w:gridCol w:w="6192"/>
-      </w:tblGrid>
-      <w:tr>
-        <w:tc>
-          <w:tcPr>
-            <w:tcW w:type="dxa" w:w="3168"/>
-            <w:shd w:fill="F8F9FA"/>
-          </w:tcPr>
-          <w:p>
-            <w:r>
-              <w:rPr>
-                <w:b/>
-                <w:color w:val="212529"/>
-                <w:sz w:val="18"/>
-              </w:rPr>
-              <w:t>Full Name / Nombre Completo:</w:t>
-            </w:r>
-          </w:p>
-        </w:tc>
-        <w:tc>
-          <w:tcPr>
-            <w:tcW w:type="dxa" w:w="6192"/>
-            <w:shd w:fill="F8F9FA"/>
-          </w:tcPr>
-          <w:p>
-            <w:r>
-              <w:rPr>
-                <w:color w:val="212529"/>
-                <w:sz w:val="18"/>
-              </w:rPr>
-            </w:r>
-          </w:p>
-        </w:tc>
-      </w:tr>
-      <w:tr>
-        <w:tc>
-          <w:tcPr>
-            <w:tcW w:type="dxa" w:w="3168"/>
-            <w:shd w:fill="F8F9FA"/>
-          </w:tcPr>
-          <w:p>
-            <w:r>
-              <w:rPr>
-                <w:b/>
-                <w:color w:val="212529"/>
-                <w:sz w:val="18"/>
-              </w:rPr>
-              <w:t>Email Address / Correo:</w:t>
-            </w:r>
-          </w:p>
-        </w:tc>
-        <w:tc>
-          <w:tcPr>
-            <w:tcW w:type="dxa" w:w="6192"/>
-            <w:shd w:fill="F8F9FA"/>
-          </w:tcPr>
-          <w:p>
-            <w:r>
-              <w:rPr>
-                <w:color w:val="212529"/>
-                <w:sz w:val="18"/>
-              </w:rPr>
-            </w:r>
-          </w:p>
-        </w:tc>
-      </w:tr>
-      <w:tr>
-        <w:tc>
-          <w:tcPr>
-            <w:tcW w:type="dxa" w:w="3168"/>
-            <w:shd w:fill="F8F9FA"/>
-          </w:tcPr>
-          <w:p>
-            <w:r>
-              <w:rPr>
-                <w:b/>
-                <w:color w:val="212529"/>
-                <w:sz w:val="18"/>
-              </w:rPr>
-              <w:t>Phone Number / Teléfono:</w:t>
-            </w:r>
-          </w:p>
-        </w:tc>
-        <w:tc>
-          <w:tcPr>
-            <w:tcW w:type="dxa" w:w="6192"/>
-            <w:shd w:fill="F8F9FA"/>
-          </w:tcPr>
-          <w:p>
-            <w:r>
-              <w:rPr>
-                <w:color w:val="212529"/>
-                <w:sz w:val="18"/>
-              </w:rPr>
-            </w:r>
-          </w:p>
-        </w:tc>
-      </w:tr>
-      <w:tr>
-        <w:tc>
-          <w:tcPr>
-            <w:tcW w:type="dxa" w:w="3168"/>
-            <w:shd w:fill="F8F9FA"/>
-          </w:tcPr>
-          <w:p>
-            <w:r>
-              <w:rPr>
-                <w:b/>
-                <w:color w:val="212529"/>
-                <w:sz w:val="18"/>
-              </w:rPr>
-              <w:t>Target Region / Región Destino:</w:t>
-            </w:r>
-          </w:p>
-        </w:tc>
-        <w:tc>
-          <w:tcPr>
-            <w:tcW w:type="dxa" w:w="6192"/>
-            <w:shd w:fill="F8F9FA"/>
-          </w:tcPr>
-          <w:p>
-            <w:r>
-              <w:rPr>
-                <w:color w:val="212529"/>
-                <w:sz w:val="18"/>
-              </w:rPr>
-              <w:t>Alicante Province / Costa Blanca (Spain)</w:t>
-            </w:r>
-          </w:p>
-        </w:tc>
-      </w:tr>
-    </w:tbl>
-    <w:p>
-      <w:pPr>
-        <w:spacing w:before="240" w:after="80"/>
-      </w:pPr>
-      <w:r>
-        <w:rPr>
-          <w:b/>
-          <w:color w:val="003DA5"/>
-          <w:sz w:val="22"/>
-        </w:rPr>
-        <w:t>COMMISSION SPLIT &amp; REFERRAL FEE</w:t>
-      </w:r>
-      <w:r>
-        <w:rPr>
-          <w:color w:val="6C757D"/>
-          <w:sz w:val="22"/>
-        </w:rPr>
-        <w:t xml:space="preserve"> / </w:t>
-      </w:r>
-      <w:r>
-        <w:rPr>
-          <w:b/>
-          <w:color w:val="E11B22"/>
-          <w:sz w:val="22"/>
-        </w:rPr>
-        <w:t>SPLIT DE COMISIÓN Y HONORARIOS DE REFERIDO</w:t>
+        <w:t>1. Purpose &amp; Scope / Objeto y Alcance</w:t>
       </w:r>
     </w:p>
     <w:p>
@@ -865,97 +617,24 @@
       </w:pPr>
       <w:r>
         <w:rPr>
+          <w:color w:val="212529"/>
           <w:sz w:val="19"/>
         </w:rPr>
-        <w:t>In consideration of the referral of the Prospect, Broker B shall compensate Broker A in the amount of (select one): / En contraprestación por la presentación del Cliente, el Corredor B compensará al Corredor A con el siguiente importe (marque uno):</w:t>
+        <w:t>The purpose of this Master Agreement is to establish the general terms under which Broker A and its licensed real estate agents may refer prospective international buyers to Broker B for the purchase of real estate in Spain, specifically within the provinces of Alicante and the Costa Blanca region. This agreement covers all future referrals made by Broker A's agents during the term of this agreement. Individual client referrals shall be documented separately in the attached Annex.</w:t>
       </w:r>
     </w:p>
     <w:p>
       <w:pPr>
-        <w:spacing w:after="60"/>
-        <w:ind w:left="283"/>
+        <w:spacing w:after="120"/>
+        <w:jc w:val="both"/>
       </w:pPr>
       <w:r>
         <w:rPr>
-          <w:b/>
-          <w:color w:val="003DA5"/>
-          <w:sz w:val="22"/>
-        </w:rPr>
-        <w:t xml:space="preserve">  ☐  </w:t>
-      </w:r>
-      <w:r>
-        <w:rPr>
-          <w:sz w:val="19"/>
-        </w:rPr>
-        <w:t>$ ______________ USD / CAD — Flat-rate referral fee / Tarifa plana.</w:t>
-      </w:r>
-    </w:p>
-    <w:p>
-      <w:pPr>
-        <w:spacing w:after="60"/>
-        <w:ind w:left="283"/>
-      </w:pPr>
-      <w:r>
-        <w:rPr>
-          <w:b/>
-          <w:color w:val="003DA5"/>
-          <w:sz w:val="22"/>
-        </w:rPr>
-        <w:t xml:space="preserve">  ☑  </w:t>
-      </w:r>
-      <w:r>
-        <w:rPr>
-          <w:sz w:val="19"/>
-        </w:rPr>
-        <w:t>25% (Twenty-Five Percent / Veinticinco Por Ciento) of the gross buyer-side commission received by Broker B / de la comisión bruta del lado comprador recibida por el Corredor B.</w:t>
-      </w:r>
-    </w:p>
-    <w:p>
-      <w:pPr>
-        <w:spacing w:after="60"/>
-        <w:ind w:left="283"/>
-      </w:pPr>
-      <w:r>
-        <w:rPr>
-          <w:b/>
-          <w:color w:val="003DA5"/>
-          <w:sz w:val="22"/>
-        </w:rPr>
-        <w:t xml:space="preserve">  ☐  </w:t>
-      </w:r>
-      <w:r>
-        <w:rPr>
-          <w:sz w:val="19"/>
-        </w:rPr>
-        <w:t>________ % of the gross buyer-side commission / de la comisión bruta del lado comprador.</w:t>
-      </w:r>
-    </w:p>
-    <w:p>
-      <w:pPr>
-        <w:spacing w:before="120" w:after="160"/>
-        <w:ind w:left="283"/>
-        <w:pBdr>
-          <w:left w:val="single" w:sz="12" w:space="4" w:color="003DA5"/>
-        </w:pBdr>
-      </w:pPr>
-      <w:r>
-        <w:rPr>
-          <w:b/>
-          <w:sz w:val="18"/>
-        </w:rPr>
-        <w:t>💡 Example / Ejemplo (25% Split):</w:t>
-        <w:br/>
-      </w:r>
-      <w:r>
-        <w:rPr>
+          <w:i/>
           <w:color w:val="6C757D"/>
           <w:sz w:val="18"/>
         </w:rPr>
-        <w:t>• Purchase Price / Precio: €400,000</w:t>
-        <w:br/>
-        <w:t>• Gross buyer commission (5%) / Comisión bruta: €20,000</w:t>
-        <w:br/>
-        <w:t>• Referring Broker payout (25%) / Pago al Corredor A: €5,000 EUR (wire/transferencia)</w:t>
+        <w:t>El objeto de este Acuerdo Marco es establecer las condiciones generales bajo las cuales el Corredor A y sus agentes inmobiliarios licenciados podrán referir compradores internacionales potenciales al Corredor B para la compra de inmuebles en España, específicamente en la provincia de Alicante y la zona de la Costa Blanca. Este acuerdo cubre todos los referidos futuros realizados por los agentes del Corredor A durante la vigencia del presente acuerdo. Cada referido individual se documentará por separado en el Anexo adjunto.</w:t>
       </w:r>
     </w:p>
     <w:p>
@@ -968,7 +647,7 @@
           <w:color w:val="003DA5"/>
           <w:sz w:val="20"/>
         </w:rPr>
-        <w:t>1. B2B Broker-to-Broker Relationship / Relación Comercial B2B</w:t>
+        <w:t>2. B2B Relationship / Relación Comercial B2B</w:t>
       </w:r>
     </w:p>
     <w:p>
@@ -995,7 +674,7 @@
           <w:color w:val="6C757D"/>
           <w:sz w:val="18"/>
         </w:rPr>
-        <w:t>Este acuerdo representa un contrato de marketing y referido de empresa a empresa (B2B). El Corredor A es una agencia legalmente autorizada en su jurisdicción de origen (EE. UU. o Canadá) y el Corredor B es una entidad inmobiliaria con licencia en España. Al tratarse de un servicio de referido internacional, el Corredor A y sus agentes no requieren licencia ni registro en España para percibir estos honorarios de servicio B2B.</w:t>
+        <w:t>Este acuerdo representa un contrato de marketing y referido de empresa a empresa (B2B). El Corredor A es una agencia legalmente autorizada en su jurisdicción de origen (EE. UU. o Canadá) y el Corredor B es una entidad inmobiliaria con licencia en España. Al tratarse de un servicio de referido internacional, el Corredor A y sus agentes no requieren licencia ni registro en España para percibir estos honorarios.</w:t>
       </w:r>
     </w:p>
     <w:p>
@@ -1008,7 +687,7 @@
           <w:color w:val="003DA5"/>
           <w:sz w:val="20"/>
         </w:rPr>
-        <w:t>2. Distribution to Involved Agents / Distribución a los Agentes Involucrados</w:t>
+        <w:t>3. Commission Structure / Estructura de Comisión</w:t>
       </w:r>
     </w:p>
     <w:p>
@@ -1021,7 +700,7 @@
           <w:color w:val="212529"/>
           <w:sz w:val="19"/>
         </w:rPr>
-        <w:t>Broker B shall wire the referral fee directly to the brokerage bank account of Broker A. Broker A is solely responsible for distributing the corresponding commission split to the Referring Real Estate Agent named above. Broker B is responsible for distributing commission splits to the local Spain Receiving Agent assigned to the transaction.</w:t>
+        <w:t>For every referred client whose property acquisition in Spain is successfully closed, Broker B shall pay Broker A a referral fee of 25% (twenty-five percent) of the gross buyer-side commission received by Broker B on that transaction. This rate applies uniformly to all referrals made under this agreement unless modified in a specific Annex.</w:t>
       </w:r>
     </w:p>
     <w:p>
@@ -1035,7 +714,35 @@
           <w:color w:val="6C757D"/>
           <w:sz w:val="18"/>
         </w:rPr>
-        <w:t>El Corredor B transferirá los honorarios de referido directamente a la cuenta bancaria corporativa del Corredor A. El Corredor A es el único responsable de distribuir la comisión correspondiente al Agente Inmobiliario Referente aquí nombrado. El Corredor B es responsable de pagar la comisión correspondiente al Agente Receptor local en España asignado a la transacción.</w:t>
+        <w:t>Por cada cliente referido cuya adquisición de propiedad en España se cierre exitosamente, el Corredor B pagará al Corredor A una comisión de referido del 25% (veinticinco por ciento) de la comisión bruta del lado comprador cobrada por el Corredor B en dicha transacción. Este porcentaje se aplica de manera uniforme a todos los referidos realizados bajo este acuerdo, salvo que se modifique en un Anexo específico.</w:t>
+      </w:r>
+    </w:p>
+    <w:p>
+      <w:pPr>
+        <w:spacing w:before="80" w:after="160"/>
+        <w:ind w:left="283"/>
+        <w:pBdr>
+          <w:left w:val="single" w:sz="12" w:space="4" w:color="003DA5"/>
+        </w:pBdr>
+      </w:pPr>
+      <w:r>
+        <w:rPr>
+          <w:b/>
+          <w:sz w:val="18"/>
+        </w:rPr>
+        <w:t>💡 Example / Ejemplo (25% Split):</w:t>
+        <w:br/>
+      </w:r>
+      <w:r>
+        <w:rPr>
+          <w:color w:val="6C757D"/>
+          <w:sz w:val="18"/>
+        </w:rPr>
+        <w:t>• Purchase Price / Precio: €400,000</w:t>
+        <w:br/>
+        <w:t>• Gross buyer commission (5%) / Comisión bruta: €20,000</w:t>
+        <w:br/>
+        <w:t>• Referral fee to Broker A (25%) / Pago al Corredor A: €5,000 EUR</w:t>
       </w:r>
     </w:p>
     <w:p>
@@ -1048,7 +755,7 @@
           <w:color w:val="003DA5"/>
           <w:sz w:val="20"/>
         </w:rPr>
-        <w:t>3. Client Registry &amp; Lock Period / Registro del Cliente y Periodo de Reserva</w:t>
+        <w:t>4. Agent Compensation / Distribución a los Agentes</w:t>
       </w:r>
     </w:p>
     <w:p>
@@ -1061,7 +768,7 @@
           <w:color w:val="212529"/>
           <w:sz w:val="19"/>
         </w:rPr>
-        <w:t>The referral is considered registered and protected once the Prospect is submitted through Broker B's portal or signed below. Broker A is entitled to the referral compensation for any real estate transaction closed by the Prospect in Spain within 24 months of the referral registration date.</w:t>
+        <w:t>All referral fees are paid strictly Broker-to-Broker. Broker A is solely responsible for distributing commission splits to its individual referring agents. Broker B is responsible for distributing commission splits to its local Spain receiving agents assigned to each transaction.</w:t>
       </w:r>
     </w:p>
     <w:p>
@@ -1075,7 +782,7 @@
           <w:color w:val="6C757D"/>
           <w:sz w:val="18"/>
         </w:rPr>
-        <w:t>El referido se considera registrado y protegido una vez que se envía el Cliente a través del portal del Corredor B o se firma el presente acuerdo. El Corredor A tendrá derecho a la compensación por referido para cualquier transacción inmobiliaria cerrada por el Cliente en España dentro de los 24 meses posteriores a la fecha de registro.</w:t>
+        <w:t>Todos los honorarios de referido se pagan estrictamente de Corredor a Corredor. El Corredor A es el único responsable de distribuir la comisión a sus agentes referentes individuales. El Corredor B es responsable de distribuir la comisión a sus agentes receptores locales en España asignados a cada transacción.</w:t>
       </w:r>
     </w:p>
     <w:p>
@@ -1088,7 +795,7 @@
           <w:color w:val="003DA5"/>
           <w:sz w:val="20"/>
         </w:rPr>
-        <w:t>4. Payout Settlement &amp; Wire Transfers / Liquidación de Pagos y Transferencias</w:t>
+        <w:t>5. Client Lock Period / Vigencia del Referido</w:t>
       </w:r>
     </w:p>
     <w:p>
@@ -1101,7 +808,7 @@
           <w:color w:val="212529"/>
           <w:sz w:val="19"/>
         </w:rPr>
-        <w:t>Referral fees shall be settled and wired to Broker A within 30 business days of the transaction closing in Spain and subsequent receipt of clear funds by Broker B. Payouts will be processed via international bank wire. Intermediary bank wire and currency conversion fees shall be borne by the recipient.</w:t>
+        <w:t>Each individual referral documented in an Annex is protected for a period of 24 months from the date of registration. Broker A is entitled to the referral fee for any transaction completed by that referred client in Spain during this period.</w:t>
       </w:r>
     </w:p>
     <w:p>
@@ -1115,7 +822,7 @@
           <w:color w:val="6C757D"/>
           <w:sz w:val="18"/>
         </w:rPr>
-        <w:t>Los honorarios de referido se liquidarán y transferirán al Corredor A dentro de los 30 días hábiles posteriores al cierre de la transacción en España y la posterior recepción de los fondos correspondientes por el Corredor B. Los pagos se realizarán mediante transferencia bancaria internacional. Los gastos bancarios intermediarios y de conversión de divisas serán asumidos por el destinatario.</w:t>
+        <w:t>Cada referido individual documentado en un Anexo estará protegido durante un periodo de 24 meses desde la fecha de registro. El Corredor A tendrá derecho a la comisión de referido por cualquier transacción completada por dicho cliente en España durante este periodo.</w:t>
       </w:r>
     </w:p>
     <w:p>
@@ -1128,7 +835,7 @@
           <w:color w:val="003DA5"/>
           <w:sz w:val="20"/>
         </w:rPr>
-        <w:t>5. Tax Compliance &amp; Invoicing / Cumplimiento Fiscal y Facturación</w:t>
+        <w:t>6. Settlement &amp; Tax Compliance / Liquidación y Cumplimiento Fiscal</w:t>
       </w:r>
     </w:p>
     <w:p>
@@ -1141,7 +848,7 @@
           <w:color w:val="212529"/>
           <w:sz w:val="19"/>
         </w:rPr>
-        <w:t>To comply with Spanish Tax Authorities, Broker A (if US-based) agrees to provide a completed IRS Form W-8BEN-E (or Canadian equivalent) to Broker B prior to payout, verifying corporate non-resident status and exempting the transaction from local Spanish withholding tax. Broker A shall also issue a commercial invoice for the referral fee amount.</w:t>
+        <w:t>Referral fees shall be wired to Broker A within 30 business days of transaction closing and receipt of clear funds by Broker B. US-based brokerages must provide a completed IRS Form W-8BEN-E (or Canadian equivalent) and a commercial invoice prior to payment to prevent local Spanish withholding tax.</w:t>
       </w:r>
     </w:p>
     <w:p>
@@ -1155,7 +862,7 @@
           <w:color w:val="6C757D"/>
           <w:sz w:val="18"/>
         </w:rPr>
-        <w:t>Para cumplir con la Agencia Tributaria Española, el Corredor A (si tiene sede en EE. UU.) se compromete a facilitar el formulario IRS W-8BEN-E (o equivalente canadiense) al Corredor B antes del pago, acreditando su condición de entidad extranjera no residente para eximir la retención fiscal en España. El Corredor A emitirá también una factura comercial por los honorarios correspondientes.</w:t>
+        <w:t>Los honorarios de referido se transferirán al Corredor A dentro de los 30 días hábiles posteriores al cierre de la transacción y cobro de los fondos por el Corredor B. Las agencias de EE. UU. deben entregar el formulario IRS W-8BEN-E (o equivalente canadiense) y una factura comercial antes del pago para evitar retenciones fiscales en España.</w:t>
       </w:r>
     </w:p>
     <w:p>
@@ -1168,7 +875,7 @@
           <w:color w:val="003DA5"/>
           <w:sz w:val="20"/>
         </w:rPr>
-        <w:t>6. Governing Law &amp; Jurisdiction / Ley Aplicable y Jurisdicción</w:t>
+        <w:t>7. Duration &amp; Termination / Vigencia y Resolución</w:t>
       </w:r>
     </w:p>
     <w:p>
@@ -1181,7 +888,7 @@
           <w:color w:val="212529"/>
           <w:sz w:val="19"/>
         </w:rPr>
-        <w:t>This agreement is governed by and construed under the laws of Spain. The parties agree that any disputes arising out of this agreement which cannot be resolved through amicable mediation shall be submitted to the exclusive jurisdiction of the Courts of Alicante, Spain.</w:t>
+        <w:t>This Agreement is effective for an initial period of 12 months from the date of signature, automatically renewing for successive 12-month periods unless either party provides 60 days' written notice of termination. Termination shall not affect referral rights on clients documented in existing Annexes.</w:t>
       </w:r>
     </w:p>
     <w:p>
@@ -1195,7 +902,47 @@
           <w:color w:val="6C757D"/>
           <w:sz w:val="18"/>
         </w:rPr>
-        <w:t>Este acuerdo se rige e interpreta según las leyes de España. Las partes acuerdan que cualquier disputa derivada de este acuerdo que no pueda resolverse mediante mediación amistosa se someterá a la jurisdicción exclusiva de los Tribunales de Alicante, España.</w:t>
+        <w:t>Este Acuerdo tendrá una vigencia inicial de 12 meses desde la fecha de firma, renovándose automáticamente por períodos sucesivos de 12 meses salvo que cualquiera de las partes comunique su resolución con un preaviso de 60 días por escrito. La resolución no afectará los derechos de referido sobre clientes documentados en Anexos existentes.</w:t>
+      </w:r>
+    </w:p>
+    <w:p>
+      <w:pPr>
+        <w:spacing w:before="200" w:after="40"/>
+      </w:pPr>
+      <w:r>
+        <w:rPr>
+          <w:b/>
+          <w:color w:val="003DA5"/>
+          <w:sz w:val="20"/>
+        </w:rPr>
+        <w:t>8. Governing Law / Ley Aplicable</w:t>
+      </w:r>
+    </w:p>
+    <w:p>
+      <w:pPr>
+        <w:spacing w:after="80"/>
+        <w:jc w:val="both"/>
+      </w:pPr>
+      <w:r>
+        <w:rPr>
+          <w:color w:val="212529"/>
+          <w:sz w:val="19"/>
+        </w:rPr>
+        <w:t>This agreement is governed by the laws of Spain. Any disputes shall be submitted exclusively to the Courts of Alicante, Spain.</w:t>
+      </w:r>
+    </w:p>
+    <w:p>
+      <w:pPr>
+        <w:spacing w:after="120"/>
+        <w:jc w:val="both"/>
+      </w:pPr>
+      <w:r>
+        <w:rPr>
+          <w:i/>
+          <w:color w:val="6C757D"/>
+          <w:sz w:val="18"/>
+        </w:rPr>
+        <w:t>Este acuerdo se rige por las leyes de España. Cualquier controversia se someterá exclusivamente a la jurisdicción de los Tribunales de Alicante, España.</w:t>
       </w:r>
     </w:p>
     <w:p>
@@ -1208,7 +955,7 @@
           <w:color w:val="003DA5"/>
           <w:sz w:val="22"/>
         </w:rPr>
-        <w:t>SIGNATURE BLOCKS</w:t>
+        <w:t>SIGNATURES</w:t>
       </w:r>
       <w:r>
         <w:rPr>
@@ -1236,7 +983,7 @@
           <w:color w:val="003DA5"/>
           <w:sz w:val="18"/>
         </w:rPr>
-        <w:t>BROKER A — Referring Brokerage Representative / Representante Corredor A</w:t>
+        <w:t>BROKER A — Referring Brokerage / Representante Corredor A</w:t>
       </w:r>
     </w:p>
     <w:p>
@@ -1305,7 +1052,7 @@
           <w:color w:val="003DA5"/>
           <w:sz w:val="18"/>
         </w:rPr>
-        <w:t>BROKER B — Megagestión Spain Representative / Representante Corredor B</w:t>
+        <w:t>BROKER B — Megagestión / Representante Corredor B</w:t>
       </w:r>
     </w:p>
     <w:p>
@@ -1382,7 +1129,7 @@
     </w:p>
     <w:p>
       <w:pPr>
-        <w:spacing w:before="480"/>
+        <w:spacing w:before="400"/>
         <w:jc w:val="center"/>
         <w:pBdr>
           <w:top w:val="single" w:sz="4" w:space="4" w:color="DEE2E6"/>
@@ -1398,6 +1145,1071 @@
         <w:t>CIF: B-54829767 • jose.martinez@remax.es • +34 966 665 651</w:t>
         <w:br/>
         <w:t>© 2026 Megagestión Servicios Inmobiliarios. All Rights Reserved.</w:t>
+      </w:r>
+    </w:p>
+    <w:p>
+      <w:r>
+        <w:br w:type="page"/>
+      </w:r>
+    </w:p>
+    <w:tbl>
+      <w:tblPr>
+        <w:tblW w:type="auto" w:w="0"/>
+        <w:jc w:val="center"/>
+        <w:tblLook w:firstColumn="1" w:firstRow="1" w:lastColumn="0" w:lastRow="0" w:noHBand="0" w:noVBand="1" w:val="04A0"/>
+      </w:tblPr>
+      <w:tblGrid>
+        <w:gridCol w:w="3168"/>
+        <w:gridCol w:w="6192"/>
+      </w:tblGrid>
+      <w:tr>
+        <w:tc>
+          <w:tcPr>
+            <w:tcW w:type="dxa" w:w="4986"/>
+            <w:vAlign w:val="center"/>
+            <w:tcBorders>
+              <w:top w:val="none" w:sz="0" w:space="0" w:color="auto"/>
+              <w:left w:val="none" w:sz="0" w:space="0" w:color="auto"/>
+              <w:bottom w:val="none" w:sz="0" w:space="0" w:color="auto"/>
+              <w:right w:val="none" w:sz="0" w:space="0" w:color="auto"/>
+            </w:tcBorders>
+          </w:tcPr>
+          <w:p>
+            <w:r>
+              <w:drawing>
+                <wp:inline xmlns:a="http://schemas.openxmlformats.org/drawingml/2006/main" xmlns:pic="http://schemas.openxmlformats.org/drawingml/2006/picture">
+                  <wp:extent cx="1188720" cy="594360"/>
+                  <wp:docPr id="2" name="Picture 2"/>
+                  <wp:cNvGraphicFramePr>
+                    <a:graphicFrameLocks noChangeAspect="1"/>
+                  </wp:cNvGraphicFramePr>
+                  <a:graphic>
+                    <a:graphicData uri="http://schemas.openxmlformats.org/drawingml/2006/picture">
+                      <pic:pic>
+                        <pic:nvPicPr>
+                          <pic:cNvPr id="0" name="remax_logo.png"/>
+                          <pic:cNvPicPr/>
+                        </pic:nvPicPr>
+                        <pic:blipFill>
+                          <a:blip r:embed="rId9"/>
+                          <a:stretch>
+                            <a:fillRect/>
+                          </a:stretch>
+                        </pic:blipFill>
+                        <pic:spPr>
+                          <a:xfrm>
+                            <a:off x="0" y="0"/>
+                            <a:ext cx="1188720" cy="594360"/>
+                          </a:xfrm>
+                          <a:prstGeom prst="rect"/>
+                        </pic:spPr>
+                      </pic:pic>
+                    </a:graphicData>
+                  </a:graphic>
+                </wp:inline>
+              </w:drawing>
+            </w:r>
+          </w:p>
+        </w:tc>
+        <w:tc>
+          <w:tcPr>
+            <w:tcW w:type="dxa" w:w="4986"/>
+            <w:vAlign w:val="center"/>
+            <w:tcBorders>
+              <w:top w:val="none" w:sz="0" w:space="0" w:color="auto"/>
+              <w:left w:val="none" w:sz="0" w:space="0" w:color="auto"/>
+              <w:bottom w:val="none" w:sz="0" w:space="0" w:color="auto"/>
+              <w:right w:val="none" w:sz="0" w:space="0" w:color="auto"/>
+            </w:tcBorders>
+          </w:tcPr>
+          <w:p>
+            <w:pPr>
+              <w:jc w:val="right"/>
+            </w:pPr>
+            <w:r>
+              <w:rPr>
+                <w:b/>
+                <w:color w:val="003DA5"/>
+                <w:sz w:val="24"/>
+              </w:rPr>
+              <w:t>ANNEX / ANEXO</w:t>
+            </w:r>
+          </w:p>
+          <w:p>
+            <w:pPr>
+              <w:jc w:val="right"/>
+            </w:pPr>
+            <w:r>
+              <w:rPr>
+                <w:color w:val="6C757D"/>
+                <w:sz w:val="16"/>
+              </w:rPr>
+              <w:t>Individual Client Referral / Ficha de Referido Individual</w:t>
+            </w:r>
+          </w:p>
+        </w:tc>
+      </w:tr>
+    </w:tbl>
+    <w:p>
+      <w:pPr>
+        <w:spacing w:before="20" w:after="80"/>
+        <w:pBdr>
+          <w:bottom w:val="single" w:sz="4" w:space="1" w:color="003DA5"/>
+        </w:pBdr>
+      </w:pPr>
+    </w:p>
+    <w:p>
+      <w:pPr>
+        <w:spacing w:after="60"/>
+      </w:pPr>
+      <w:r>
+        <w:rPr>
+          <w:b/>
+          <w:color w:val="003DA5"/>
+          <w:sz w:val="16"/>
+        </w:rPr>
+        <w:t>Referral # / Nº: ______________    Date / Fecha: ______________    Master Agreement date / Fecha Acuerdo Marco: ____/____/________</w:t>
+      </w:r>
+    </w:p>
+    <w:p>
+      <w:pPr>
+        <w:spacing w:after="100"/>
+        <w:jc w:val="both"/>
+      </w:pPr>
+      <w:r>
+        <w:rPr>
+          <w:i/>
+          <w:color w:val="6C757D"/>
+          <w:sz w:val="15"/>
+        </w:rPr>
+        <w:t>This Annex is subject to the Master Referral Agreement. The referral is protected for 24 months. / Este Anexo está sujeto al Acuerdo Marco. El referido queda protegido durante 24 meses.</w:t>
+      </w:r>
+    </w:p>
+    <w:p>
+      <w:pPr>
+        <w:spacing w:before="120" w:after="40"/>
+      </w:pPr>
+      <w:r>
+        <w:rPr>
+          <w:b/>
+          <w:color w:val="003DA5"/>
+          <w:sz w:val="18"/>
+        </w:rPr>
+        <w:t>Referring Agent / Agente Referente (US/Canada)</w:t>
+      </w:r>
+    </w:p>
+    <w:tbl>
+      <w:tblPr>
+        <w:tblW w:type="auto" w:w="0"/>
+        <w:tblLook w:firstColumn="1" w:firstRow="1" w:lastColumn="0" w:lastRow="0" w:noHBand="0" w:noVBand="1" w:val="04A0"/>
+      </w:tblPr>
+      <w:tblGrid>
+        <w:gridCol w:w="2592"/>
+        <w:gridCol w:w="6768"/>
+      </w:tblGrid>
+      <w:tr>
+        <w:tc>
+          <w:tcPr>
+            <w:tcW w:type="dxa" w:w="2592"/>
+            <w:shd w:fill="F8F9FA"/>
+          </w:tcPr>
+          <w:p>
+            <w:pPr>
+              <w:spacing w:after="0" w:before="0"/>
+            </w:pPr>
+            <w:r>
+              <w:rPr>
+                <w:b/>
+                <w:color w:val="212529"/>
+                <w:sz w:val="16"/>
+              </w:rPr>
+              <w:t>Name / Nombre:</w:t>
+            </w:r>
+          </w:p>
+        </w:tc>
+        <w:tc>
+          <w:tcPr>
+            <w:tcW w:type="dxa" w:w="6768"/>
+            <w:shd w:fill="F8F9FA"/>
+          </w:tcPr>
+          <w:p>
+            <w:pPr>
+              <w:spacing w:after="0" w:before="0"/>
+            </w:pPr>
+            <w:r>
+              <w:rPr>
+                <w:color w:val="212529"/>
+                <w:sz w:val="16"/>
+              </w:rPr>
+            </w:r>
+          </w:p>
+        </w:tc>
+      </w:tr>
+      <w:tr>
+        <w:tc>
+          <w:tcPr>
+            <w:tcW w:type="dxa" w:w="2592"/>
+            <w:shd w:fill="F8F9FA"/>
+          </w:tcPr>
+          <w:p>
+            <w:pPr>
+              <w:spacing w:after="0" w:before="0"/>
+            </w:pPr>
+            <w:r>
+              <w:rPr>
+                <w:b/>
+                <w:color w:val="212529"/>
+                <w:sz w:val="16"/>
+              </w:rPr>
+              <w:t>License # / Licencia:</w:t>
+            </w:r>
+          </w:p>
+        </w:tc>
+        <w:tc>
+          <w:tcPr>
+            <w:tcW w:type="dxa" w:w="6768"/>
+            <w:shd w:fill="F8F9FA"/>
+          </w:tcPr>
+          <w:p>
+            <w:pPr>
+              <w:spacing w:after="0" w:before="0"/>
+            </w:pPr>
+            <w:r>
+              <w:rPr>
+                <w:color w:val="212529"/>
+                <w:sz w:val="16"/>
+              </w:rPr>
+            </w:r>
+          </w:p>
+        </w:tc>
+      </w:tr>
+      <w:tr>
+        <w:tc>
+          <w:tcPr>
+            <w:tcW w:type="dxa" w:w="2592"/>
+            <w:shd w:fill="F8F9FA"/>
+          </w:tcPr>
+          <w:p>
+            <w:pPr>
+              <w:spacing w:after="0" w:before="0"/>
+            </w:pPr>
+            <w:r>
+              <w:rPr>
+                <w:b/>
+                <w:color w:val="212529"/>
+                <w:sz w:val="16"/>
+              </w:rPr>
+              <w:t>Email / Correo:</w:t>
+            </w:r>
+          </w:p>
+        </w:tc>
+        <w:tc>
+          <w:tcPr>
+            <w:tcW w:type="dxa" w:w="6768"/>
+            <w:shd w:fill="F8F9FA"/>
+          </w:tcPr>
+          <w:p>
+            <w:pPr>
+              <w:spacing w:after="0" w:before="0"/>
+            </w:pPr>
+            <w:r>
+              <w:rPr>
+                <w:color w:val="212529"/>
+                <w:sz w:val="16"/>
+              </w:rPr>
+            </w:r>
+          </w:p>
+        </w:tc>
+      </w:tr>
+      <w:tr>
+        <w:tc>
+          <w:tcPr>
+            <w:tcW w:type="dxa" w:w="2592"/>
+            <w:shd w:fill="F8F9FA"/>
+          </w:tcPr>
+          <w:p>
+            <w:pPr>
+              <w:spacing w:after="0" w:before="0"/>
+            </w:pPr>
+            <w:r>
+              <w:rPr>
+                <w:b/>
+                <w:color w:val="212529"/>
+                <w:sz w:val="16"/>
+              </w:rPr>
+              <w:t>Phone / Teléfono:</w:t>
+            </w:r>
+          </w:p>
+        </w:tc>
+        <w:tc>
+          <w:tcPr>
+            <w:tcW w:type="dxa" w:w="6768"/>
+            <w:shd w:fill="F8F9FA"/>
+          </w:tcPr>
+          <w:p>
+            <w:pPr>
+              <w:spacing w:after="0" w:before="0"/>
+            </w:pPr>
+            <w:r>
+              <w:rPr>
+                <w:color w:val="212529"/>
+                <w:sz w:val="16"/>
+              </w:rPr>
+            </w:r>
+          </w:p>
+        </w:tc>
+      </w:tr>
+      <w:tr>
+        <w:tc>
+          <w:tcPr>
+            <w:tcW w:type="dxa" w:w="2592"/>
+            <w:shd w:fill="F8F9FA"/>
+          </w:tcPr>
+          <w:p>
+            <w:pPr>
+              <w:spacing w:after="0" w:before="0"/>
+            </w:pPr>
+            <w:r>
+              <w:rPr>
+                <w:b/>
+                <w:color w:val="212529"/>
+                <w:sz w:val="16"/>
+              </w:rPr>
+              <w:t>Brokerage / Agencia:</w:t>
+            </w:r>
+          </w:p>
+        </w:tc>
+        <w:tc>
+          <w:tcPr>
+            <w:tcW w:type="dxa" w:w="6768"/>
+            <w:shd w:fill="F8F9FA"/>
+          </w:tcPr>
+          <w:p>
+            <w:pPr>
+              <w:spacing w:after="0" w:before="0"/>
+            </w:pPr>
+            <w:r>
+              <w:rPr>
+                <w:color w:val="212529"/>
+                <w:sz w:val="16"/>
+              </w:rPr>
+            </w:r>
+          </w:p>
+        </w:tc>
+      </w:tr>
+    </w:tbl>
+    <w:p>
+      <w:pPr>
+        <w:spacing w:before="120" w:after="40"/>
+      </w:pPr>
+      <w:r>
+        <w:rPr>
+          <w:b/>
+          <w:color w:val="003DA5"/>
+          <w:sz w:val="18"/>
+        </w:rPr>
+        <w:t>Receiving Agent / Agente Receptor (Spain)</w:t>
+      </w:r>
+    </w:p>
+    <w:tbl>
+      <w:tblPr>
+        <w:tblW w:type="auto" w:w="0"/>
+        <w:tblLook w:firstColumn="1" w:firstRow="1" w:lastColumn="0" w:lastRow="0" w:noHBand="0" w:noVBand="1" w:val="04A0"/>
+      </w:tblPr>
+      <w:tblGrid>
+        <w:gridCol w:w="2592"/>
+        <w:gridCol w:w="6768"/>
+      </w:tblGrid>
+      <w:tr>
+        <w:tc>
+          <w:tcPr>
+            <w:tcW w:type="dxa" w:w="2592"/>
+            <w:shd w:fill="F8F9FA"/>
+          </w:tcPr>
+          <w:p>
+            <w:pPr>
+              <w:spacing w:after="0" w:before="0"/>
+            </w:pPr>
+            <w:r>
+              <w:rPr>
+                <w:b/>
+                <w:color w:val="212529"/>
+                <w:sz w:val="16"/>
+              </w:rPr>
+              <w:t>Name / Nombre:</w:t>
+            </w:r>
+          </w:p>
+        </w:tc>
+        <w:tc>
+          <w:tcPr>
+            <w:tcW w:type="dxa" w:w="6768"/>
+            <w:shd w:fill="F8F9FA"/>
+          </w:tcPr>
+          <w:p>
+            <w:pPr>
+              <w:spacing w:after="0" w:before="0"/>
+            </w:pPr>
+            <w:r>
+              <w:rPr>
+                <w:color w:val="212529"/>
+                <w:sz w:val="16"/>
+              </w:rPr>
+            </w:r>
+          </w:p>
+        </w:tc>
+      </w:tr>
+      <w:tr>
+        <w:tc>
+          <w:tcPr>
+            <w:tcW w:type="dxa" w:w="2592"/>
+            <w:shd w:fill="F8F9FA"/>
+          </w:tcPr>
+          <w:p>
+            <w:pPr>
+              <w:spacing w:after="0" w:before="0"/>
+            </w:pPr>
+            <w:r>
+              <w:rPr>
+                <w:b/>
+                <w:color w:val="212529"/>
+                <w:sz w:val="16"/>
+              </w:rPr>
+              <w:t>Email / Correo:</w:t>
+            </w:r>
+          </w:p>
+        </w:tc>
+        <w:tc>
+          <w:tcPr>
+            <w:tcW w:type="dxa" w:w="6768"/>
+            <w:shd w:fill="F8F9FA"/>
+          </w:tcPr>
+          <w:p>
+            <w:pPr>
+              <w:spacing w:after="0" w:before="0"/>
+            </w:pPr>
+            <w:r>
+              <w:rPr>
+                <w:color w:val="212529"/>
+                <w:sz w:val="16"/>
+              </w:rPr>
+            </w:r>
+          </w:p>
+        </w:tc>
+      </w:tr>
+      <w:tr>
+        <w:tc>
+          <w:tcPr>
+            <w:tcW w:type="dxa" w:w="2592"/>
+            <w:shd w:fill="F8F9FA"/>
+          </w:tcPr>
+          <w:p>
+            <w:pPr>
+              <w:spacing w:after="0" w:before="0"/>
+            </w:pPr>
+            <w:r>
+              <w:rPr>
+                <w:b/>
+                <w:color w:val="212529"/>
+                <w:sz w:val="16"/>
+              </w:rPr>
+              <w:t>Phone / Teléfono:</w:t>
+            </w:r>
+          </w:p>
+        </w:tc>
+        <w:tc>
+          <w:tcPr>
+            <w:tcW w:type="dxa" w:w="6768"/>
+            <w:shd w:fill="F8F9FA"/>
+          </w:tcPr>
+          <w:p>
+            <w:pPr>
+              <w:spacing w:after="0" w:before="0"/>
+            </w:pPr>
+            <w:r>
+              <w:rPr>
+                <w:color w:val="212529"/>
+                <w:sz w:val="16"/>
+              </w:rPr>
+            </w:r>
+          </w:p>
+        </w:tc>
+      </w:tr>
+      <w:tr>
+        <w:tc>
+          <w:tcPr>
+            <w:tcW w:type="dxa" w:w="2592"/>
+            <w:shd w:fill="F8F9FA"/>
+          </w:tcPr>
+          <w:p>
+            <w:pPr>
+              <w:spacing w:after="0" w:before="0"/>
+            </w:pPr>
+            <w:r>
+              <w:rPr>
+                <w:b/>
+                <w:color w:val="212529"/>
+                <w:sz w:val="16"/>
+              </w:rPr>
+              <w:t>Office / Oficina:</w:t>
+            </w:r>
+          </w:p>
+        </w:tc>
+        <w:tc>
+          <w:tcPr>
+            <w:tcW w:type="dxa" w:w="6768"/>
+            <w:shd w:fill="F8F9FA"/>
+          </w:tcPr>
+          <w:p>
+            <w:pPr>
+              <w:spacing w:after="0" w:before="0"/>
+            </w:pPr>
+            <w:r>
+              <w:rPr>
+                <w:color w:val="212529"/>
+                <w:sz w:val="16"/>
+              </w:rPr>
+              <w:t>RE/MAX Inmomás</w:t>
+            </w:r>
+          </w:p>
+        </w:tc>
+      </w:tr>
+    </w:tbl>
+    <w:p>
+      <w:pPr>
+        <w:spacing w:before="120" w:after="40"/>
+      </w:pPr>
+      <w:r>
+        <w:rPr>
+          <w:b/>
+          <w:color w:val="003DA5"/>
+          <w:sz w:val="18"/>
+        </w:rPr>
+        <w:t>Prospect / Cliente Referido</w:t>
+      </w:r>
+    </w:p>
+    <w:tbl>
+      <w:tblPr>
+        <w:tblW w:type="auto" w:w="0"/>
+        <w:tblLook w:firstColumn="1" w:firstRow="1" w:lastColumn="0" w:lastRow="0" w:noHBand="0" w:noVBand="1" w:val="04A0"/>
+      </w:tblPr>
+      <w:tblGrid>
+        <w:gridCol w:w="2592"/>
+        <w:gridCol w:w="6768"/>
+      </w:tblGrid>
+      <w:tr>
+        <w:tc>
+          <w:tcPr>
+            <w:tcW w:type="dxa" w:w="2592"/>
+            <w:shd w:fill="F8F9FA"/>
+          </w:tcPr>
+          <w:p>
+            <w:pPr>
+              <w:spacing w:after="0" w:before="0"/>
+            </w:pPr>
+            <w:r>
+              <w:rPr>
+                <w:b/>
+                <w:color w:val="212529"/>
+                <w:sz w:val="16"/>
+              </w:rPr>
+              <w:t>Full Name / Nombre:</w:t>
+            </w:r>
+          </w:p>
+        </w:tc>
+        <w:tc>
+          <w:tcPr>
+            <w:tcW w:type="dxa" w:w="6768"/>
+            <w:shd w:fill="F8F9FA"/>
+          </w:tcPr>
+          <w:p>
+            <w:pPr>
+              <w:spacing w:after="0" w:before="0"/>
+            </w:pPr>
+            <w:r>
+              <w:rPr>
+                <w:color w:val="212529"/>
+                <w:sz w:val="16"/>
+              </w:rPr>
+            </w:r>
+          </w:p>
+        </w:tc>
+      </w:tr>
+      <w:tr>
+        <w:tc>
+          <w:tcPr>
+            <w:tcW w:type="dxa" w:w="2592"/>
+            <w:shd w:fill="F8F9FA"/>
+          </w:tcPr>
+          <w:p>
+            <w:pPr>
+              <w:spacing w:after="0" w:before="0"/>
+            </w:pPr>
+            <w:r>
+              <w:rPr>
+                <w:b/>
+                <w:color w:val="212529"/>
+                <w:sz w:val="16"/>
+              </w:rPr>
+              <w:t>Email / Correo:</w:t>
+            </w:r>
+          </w:p>
+        </w:tc>
+        <w:tc>
+          <w:tcPr>
+            <w:tcW w:type="dxa" w:w="6768"/>
+            <w:shd w:fill="F8F9FA"/>
+          </w:tcPr>
+          <w:p>
+            <w:pPr>
+              <w:spacing w:after="0" w:before="0"/>
+            </w:pPr>
+            <w:r>
+              <w:rPr>
+                <w:color w:val="212529"/>
+                <w:sz w:val="16"/>
+              </w:rPr>
+            </w:r>
+          </w:p>
+        </w:tc>
+      </w:tr>
+      <w:tr>
+        <w:tc>
+          <w:tcPr>
+            <w:tcW w:type="dxa" w:w="2592"/>
+            <w:shd w:fill="F8F9FA"/>
+          </w:tcPr>
+          <w:p>
+            <w:pPr>
+              <w:spacing w:after="0" w:before="0"/>
+            </w:pPr>
+            <w:r>
+              <w:rPr>
+                <w:b/>
+                <w:color w:val="212529"/>
+                <w:sz w:val="16"/>
+              </w:rPr>
+              <w:t>Phone / Teléfono:</w:t>
+            </w:r>
+          </w:p>
+        </w:tc>
+        <w:tc>
+          <w:tcPr>
+            <w:tcW w:type="dxa" w:w="6768"/>
+            <w:shd w:fill="F8F9FA"/>
+          </w:tcPr>
+          <w:p>
+            <w:pPr>
+              <w:spacing w:after="0" w:before="0"/>
+            </w:pPr>
+            <w:r>
+              <w:rPr>
+                <w:color w:val="212529"/>
+                <w:sz w:val="16"/>
+              </w:rPr>
+            </w:r>
+          </w:p>
+        </w:tc>
+      </w:tr>
+      <w:tr>
+        <w:tc>
+          <w:tcPr>
+            <w:tcW w:type="dxa" w:w="2592"/>
+            <w:shd w:fill="F8F9FA"/>
+          </w:tcPr>
+          <w:p>
+            <w:pPr>
+              <w:spacing w:after="0" w:before="0"/>
+            </w:pPr>
+            <w:r>
+              <w:rPr>
+                <w:b/>
+                <w:color w:val="212529"/>
+                <w:sz w:val="16"/>
+              </w:rPr>
+              <w:t>Region / Región:</w:t>
+            </w:r>
+          </w:p>
+        </w:tc>
+        <w:tc>
+          <w:tcPr>
+            <w:tcW w:type="dxa" w:w="6768"/>
+            <w:shd w:fill="F8F9FA"/>
+          </w:tcPr>
+          <w:p>
+            <w:pPr>
+              <w:spacing w:after="0" w:before="0"/>
+            </w:pPr>
+            <w:r>
+              <w:rPr>
+                <w:color w:val="212529"/>
+                <w:sz w:val="16"/>
+              </w:rPr>
+              <w:t>Alicante Province / Costa Blanca</w:t>
+            </w:r>
+          </w:p>
+        </w:tc>
+      </w:tr>
+      <w:tr>
+        <w:tc>
+          <w:tcPr>
+            <w:tcW w:type="dxa" w:w="2592"/>
+            <w:shd w:fill="F8F9FA"/>
+          </w:tcPr>
+          <w:p>
+            <w:pPr>
+              <w:spacing w:after="0" w:before="0"/>
+            </w:pPr>
+            <w:r>
+              <w:rPr>
+                <w:b/>
+                <w:color w:val="212529"/>
+                <w:sz w:val="16"/>
+              </w:rPr>
+              <w:t>Budget / Presupuesto:</w:t>
+            </w:r>
+          </w:p>
+        </w:tc>
+        <w:tc>
+          <w:tcPr>
+            <w:tcW w:type="dxa" w:w="6768"/>
+            <w:shd w:fill="F8F9FA"/>
+          </w:tcPr>
+          <w:p>
+            <w:pPr>
+              <w:spacing w:after="0" w:before="0"/>
+            </w:pPr>
+            <w:r>
+              <w:rPr>
+                <w:color w:val="212529"/>
+                <w:sz w:val="16"/>
+              </w:rPr>
+            </w:r>
+          </w:p>
+        </w:tc>
+      </w:tr>
+      <w:tr>
+        <w:tc>
+          <w:tcPr>
+            <w:tcW w:type="dxa" w:w="2592"/>
+            <w:shd w:fill="F8F9FA"/>
+          </w:tcPr>
+          <w:p>
+            <w:pPr>
+              <w:spacing w:after="0" w:before="0"/>
+            </w:pPr>
+            <w:r>
+              <w:rPr>
+                <w:b/>
+                <w:color w:val="212529"/>
+                <w:sz w:val="16"/>
+              </w:rPr>
+              <w:t>Property Type / Tipo:</w:t>
+            </w:r>
+          </w:p>
+        </w:tc>
+        <w:tc>
+          <w:tcPr>
+            <w:tcW w:type="dxa" w:w="6768"/>
+            <w:shd w:fill="F8F9FA"/>
+          </w:tcPr>
+          <w:p>
+            <w:pPr>
+              <w:spacing w:after="0" w:before="0"/>
+            </w:pPr>
+            <w:r>
+              <w:rPr>
+                <w:color w:val="212529"/>
+                <w:sz w:val="16"/>
+              </w:rPr>
+            </w:r>
+          </w:p>
+        </w:tc>
+      </w:tr>
+      <w:tr>
+        <w:tc>
+          <w:tcPr>
+            <w:tcW w:type="dxa" w:w="2592"/>
+            <w:shd w:fill="F8F9FA"/>
+          </w:tcPr>
+          <w:p>
+            <w:pPr>
+              <w:spacing w:after="0" w:before="0"/>
+            </w:pPr>
+            <w:r>
+              <w:rPr>
+                <w:b/>
+                <w:color w:val="212529"/>
+                <w:sz w:val="16"/>
+              </w:rPr>
+              <w:t>Notes / Notas:</w:t>
+            </w:r>
+          </w:p>
+        </w:tc>
+        <w:tc>
+          <w:tcPr>
+            <w:tcW w:type="dxa" w:w="6768"/>
+            <w:shd w:fill="F8F9FA"/>
+          </w:tcPr>
+          <w:p>
+            <w:pPr>
+              <w:spacing w:after="0" w:before="0"/>
+            </w:pPr>
+            <w:r>
+              <w:rPr>
+                <w:color w:val="212529"/>
+                <w:sz w:val="16"/>
+              </w:rPr>
+            </w:r>
+          </w:p>
+        </w:tc>
+      </w:tr>
+    </w:tbl>
+    <w:p>
+      <w:pPr>
+        <w:spacing w:before="120" w:after="60"/>
+      </w:pPr>
+      <w:r>
+        <w:rPr>
+          <w:b/>
+          <w:color w:val="003DA5"/>
+          <w:sz w:val="17"/>
+        </w:rPr>
+        <w:t xml:space="preserve">Referral Fee / Comisión: </w:t>
+      </w:r>
+      <w:r>
+        <w:rPr>
+          <w:sz w:val="17"/>
+        </w:rPr>
+        <w:t xml:space="preserve">As per Master Agreement: 25% / Según Acuerdo Marco: 25%   </w:t>
+      </w:r>
+      <w:r>
+        <w:rPr>
+          <w:color w:val="6C757D"/>
+          <w:sz w:val="16"/>
+        </w:rPr>
+        <w:t>☐ Modified / Modificado: ________ %</w:t>
+      </w:r>
+    </w:p>
+    <w:tbl>
+      <w:tblPr>
+        <w:tblW w:type="auto" w:w="0"/>
+        <w:tblLook w:firstColumn="1" w:firstRow="1" w:lastColumn="0" w:lastRow="0" w:noHBand="0" w:noVBand="1" w:val="04A0"/>
+      </w:tblPr>
+      <w:tblGrid>
+        <w:gridCol w:w="4680"/>
+        <w:gridCol w:w="4680"/>
+      </w:tblGrid>
+      <w:tr>
+        <w:tc>
+          <w:tcPr>
+            <w:tcW w:type="dxa" w:w="4986"/>
+            <w:tcBorders>
+              <w:top w:val="none" w:sz="0" w:space="0" w:color="auto"/>
+              <w:left w:val="none" w:sz="0" w:space="0" w:color="auto"/>
+              <w:bottom w:val="none" w:sz="0" w:space="0" w:color="auto"/>
+              <w:right w:val="none" w:sz="0" w:space="0" w:color="auto"/>
+            </w:tcBorders>
+          </w:tcPr>
+          <w:p>
+            <w:pPr>
+              <w:spacing w:before="160" w:after="0"/>
+            </w:pPr>
+            <w:r>
+              <w:rPr>
+                <w:b/>
+                <w:color w:val="003DA5"/>
+                <w:sz w:val="15"/>
+              </w:rPr>
+              <w:t>Broker A Representative / Representante Corredor A</w:t>
+            </w:r>
+          </w:p>
+        </w:tc>
+        <w:tc>
+          <w:tcPr>
+            <w:tcW w:type="dxa" w:w="4986"/>
+            <w:tcBorders>
+              <w:top w:val="none" w:sz="0" w:space="0" w:color="auto"/>
+              <w:left w:val="none" w:sz="0" w:space="0" w:color="auto"/>
+              <w:bottom w:val="none" w:sz="0" w:space="0" w:color="auto"/>
+              <w:right w:val="none" w:sz="0" w:space="0" w:color="auto"/>
+            </w:tcBorders>
+          </w:tcPr>
+          <w:p>
+            <w:pPr>
+              <w:spacing w:before="160" w:after="0"/>
+            </w:pPr>
+            <w:r>
+              <w:rPr>
+                <w:b/>
+                <w:color w:val="003DA5"/>
+                <w:sz w:val="15"/>
+              </w:rPr>
+              <w:t>Broker B Representative / Representante Corredor B</w:t>
+            </w:r>
+          </w:p>
+        </w:tc>
+      </w:tr>
+      <w:tr>
+        <w:tc>
+          <w:tcPr>
+            <w:tcW w:type="dxa" w:w="4986"/>
+            <w:tcBorders>
+              <w:top w:val="none" w:sz="0" w:space="0" w:color="auto"/>
+              <w:left w:val="none" w:sz="0" w:space="0" w:color="auto"/>
+              <w:bottom w:val="none" w:sz="0" w:space="0" w:color="auto"/>
+              <w:right w:val="none" w:sz="0" w:space="0" w:color="auto"/>
+            </w:tcBorders>
+          </w:tcPr>
+          <w:p>
+            <w:pPr>
+              <w:spacing w:before="320" w:after="0"/>
+              <w:pBdr>
+                <w:bottom w:val="single" w:sz="4" w:space="1" w:color="212529"/>
+              </w:pBdr>
+            </w:pPr>
+          </w:p>
+        </w:tc>
+        <w:tc>
+          <w:tcPr>
+            <w:tcW w:type="dxa" w:w="4986"/>
+            <w:tcBorders>
+              <w:top w:val="none" w:sz="0" w:space="0" w:color="auto"/>
+              <w:left w:val="none" w:sz="0" w:space="0" w:color="auto"/>
+              <w:bottom w:val="none" w:sz="0" w:space="0" w:color="auto"/>
+              <w:right w:val="none" w:sz="0" w:space="0" w:color="auto"/>
+            </w:tcBorders>
+          </w:tcPr>
+          <w:p>
+            <w:pPr>
+              <w:spacing w:before="320" w:after="0"/>
+              <w:pBdr>
+                <w:bottom w:val="single" w:sz="4" w:space="1" w:color="212529"/>
+              </w:pBdr>
+            </w:pPr>
+          </w:p>
+        </w:tc>
+      </w:tr>
+      <w:tr>
+        <w:tc>
+          <w:tcPr>
+            <w:tcW w:type="dxa" w:w="4986"/>
+            <w:tcBorders>
+              <w:top w:val="none" w:sz="0" w:space="0" w:color="auto"/>
+              <w:left w:val="none" w:sz="0" w:space="0" w:color="auto"/>
+              <w:bottom w:val="none" w:sz="0" w:space="0" w:color="auto"/>
+              <w:right w:val="none" w:sz="0" w:space="0" w:color="auto"/>
+            </w:tcBorders>
+          </w:tcPr>
+          <w:p>
+            <w:pPr>
+              <w:spacing w:after="0"/>
+            </w:pPr>
+            <w:r>
+              <w:rPr>
+                <w:color w:val="6C757D"/>
+                <w:sz w:val="16"/>
+              </w:rPr>
+              <w:t xml:space="preserve">Name / Nombre: </w:t>
+            </w:r>
+          </w:p>
+        </w:tc>
+        <w:tc>
+          <w:tcPr>
+            <w:tcW w:type="dxa" w:w="4986"/>
+            <w:tcBorders>
+              <w:top w:val="none" w:sz="0" w:space="0" w:color="auto"/>
+              <w:left w:val="none" w:sz="0" w:space="0" w:color="auto"/>
+              <w:bottom w:val="none" w:sz="0" w:space="0" w:color="auto"/>
+              <w:right w:val="none" w:sz="0" w:space="0" w:color="auto"/>
+            </w:tcBorders>
+          </w:tcPr>
+          <w:p>
+            <w:pPr>
+              <w:spacing w:after="0"/>
+            </w:pPr>
+            <w:r>
+              <w:rPr>
+                <w:color w:val="6C757D"/>
+                <w:sz w:val="16"/>
+              </w:rPr>
+              <w:t xml:space="preserve">Name / Nombre: </w:t>
+            </w:r>
+            <w:r>
+              <w:rPr>
+                <w:b/>
+                <w:color w:val="212529"/>
+                <w:sz w:val="16"/>
+              </w:rPr>
+              <w:t>José Martínez Sánchez</w:t>
+            </w:r>
+          </w:p>
+        </w:tc>
+      </w:tr>
+      <w:tr>
+        <w:tc>
+          <w:tcPr>
+            <w:tcW w:type="dxa" w:w="4986"/>
+            <w:tcBorders>
+              <w:top w:val="none" w:sz="0" w:space="0" w:color="auto"/>
+              <w:left w:val="none" w:sz="0" w:space="0" w:color="auto"/>
+              <w:bottom w:val="none" w:sz="0" w:space="0" w:color="auto"/>
+              <w:right w:val="none" w:sz="0" w:space="0" w:color="auto"/>
+            </w:tcBorders>
+          </w:tcPr>
+          <w:p>
+            <w:pPr>
+              <w:spacing w:after="0"/>
+            </w:pPr>
+            <w:r>
+              <w:rPr>
+                <w:color w:val="6C757D"/>
+                <w:sz w:val="16"/>
+              </w:rPr>
+              <w:t>Date / Fecha: ____________________</w:t>
+            </w:r>
+          </w:p>
+        </w:tc>
+        <w:tc>
+          <w:tcPr>
+            <w:tcW w:type="dxa" w:w="4986"/>
+            <w:tcBorders>
+              <w:top w:val="none" w:sz="0" w:space="0" w:color="auto"/>
+              <w:left w:val="none" w:sz="0" w:space="0" w:color="auto"/>
+              <w:bottom w:val="none" w:sz="0" w:space="0" w:color="auto"/>
+              <w:right w:val="none" w:sz="0" w:space="0" w:color="auto"/>
+            </w:tcBorders>
+          </w:tcPr>
+          <w:p>
+            <w:pPr>
+              <w:spacing w:after="0"/>
+            </w:pPr>
+            <w:r>
+              <w:rPr>
+                <w:color w:val="6C757D"/>
+                <w:sz w:val="16"/>
+              </w:rPr>
+              <w:t>Date / Fecha: ____________________</w:t>
+            </w:r>
+          </w:p>
+        </w:tc>
+      </w:tr>
+    </w:tbl>
+    <w:p>
+      <w:pPr>
+        <w:spacing w:before="200"/>
+        <w:jc w:val="center"/>
+        <w:pBdr>
+          <w:top w:val="single" w:sz="4" w:space="3" w:color="DEE2E6"/>
+        </w:pBdr>
+      </w:pPr>
+      <w:r>
+        <w:rPr>
+          <w:color w:val="6C757D"/>
+          <w:sz w:val="14"/>
+        </w:rPr>
+        <w:t>Megagestión Servicios Inmobiliarios • CIF: B-54829767 • jose.martinez@remax.es • +34 966 665 651</w:t>
+        <w:br/>
+        <w:t>This Annex is an integral part of the Master Referral Agreement / Este Anexo forma parte integral del Acuerdo Marco de Referidos.</w:t>
       </w:r>
     </w:p>
     <w:sectPr>

</xml_diff>

<commit_message>
Update referral agreement to be broker-to-broker and remove upload flow
</commit_message>
<xml_diff>
--- a/USA - Spain /Referral_Agreement_Template.docx
+++ b/USA - Spain /Referral_Agreement_Template.docx
@@ -755,7 +755,7 @@
           <w:color w:val="003DA5"/>
           <w:sz w:val="20"/>
         </w:rPr>
-        <w:t>4. Agent Compensation / Distribución a los Agentes</w:t>
+        <w:t>4. Broker Compensation / Compensación entre Corredores</w:t>
       </w:r>
     </w:p>
     <w:p>
@@ -768,7 +768,7 @@
           <w:color w:val="212529"/>
           <w:sz w:val="19"/>
         </w:rPr>
-        <w:t>All referral fees are paid strictly Broker-to-Broker. Broker A is solely responsible for distributing commission splits to its individual referring agents. Broker B is responsible for distributing commission splits to its local Spain receiving agents assigned to each transaction.</w:t>
+        <w:t>All referral fees are paid strictly Broker-to-Broker. Broker A is solely responsible for any internal distribution of the commission within its brokerage. Broker B is responsible for any internal distribution within its brokerage.</w:t>
       </w:r>
     </w:p>
     <w:p>
@@ -782,7 +782,7 @@
           <w:color w:val="6C757D"/>
           <w:sz w:val="18"/>
         </w:rPr>
-        <w:t>Todos los honorarios de referido se pagan estrictamente de Corredor a Corredor. El Corredor A es el único responsable de distribuir la comisión a sus agentes referentes individuales. El Corredor B es responsable de distribuir la comisión a sus agentes receptores locales en España asignados a cada transacción.</w:t>
+        <w:t>Todos los honorarios de referido se pagan estrictamente de Corredor a Corredor. El Corredor A es el único responsable de cualquier distribución interna de la comisión dentro de su agencia. El Corredor B es responsable de cualquier distribución interna dentro de su agencia.</w:t>
       </w:r>
     </w:p>
     <w:p>
@@ -1285,395 +1285,6 @@
         <w:t>This Annex is subject to the Master Referral Agreement. The referral is protected for 24 months. / Este Anexo está sujeto al Acuerdo Marco. El referido queda protegido durante 24 meses.</w:t>
       </w:r>
     </w:p>
-    <w:p>
-      <w:pPr>
-        <w:spacing w:before="120" w:after="40"/>
-      </w:pPr>
-      <w:r>
-        <w:rPr>
-          <w:b/>
-          <w:color w:val="003DA5"/>
-          <w:sz w:val="18"/>
-        </w:rPr>
-        <w:t>Referring Agent / Agente Referente (US/Canada)</w:t>
-      </w:r>
-    </w:p>
-    <w:tbl>
-      <w:tblPr>
-        <w:tblW w:type="auto" w:w="0"/>
-        <w:tblLook w:firstColumn="1" w:firstRow="1" w:lastColumn="0" w:lastRow="0" w:noHBand="0" w:noVBand="1" w:val="04A0"/>
-      </w:tblPr>
-      <w:tblGrid>
-        <w:gridCol w:w="2592"/>
-        <w:gridCol w:w="6768"/>
-      </w:tblGrid>
-      <w:tr>
-        <w:tc>
-          <w:tcPr>
-            <w:tcW w:type="dxa" w:w="2592"/>
-            <w:shd w:fill="F8F9FA"/>
-          </w:tcPr>
-          <w:p>
-            <w:pPr>
-              <w:spacing w:after="0" w:before="0"/>
-            </w:pPr>
-            <w:r>
-              <w:rPr>
-                <w:b/>
-                <w:color w:val="212529"/>
-                <w:sz w:val="16"/>
-              </w:rPr>
-              <w:t>Name / Nombre:</w:t>
-            </w:r>
-          </w:p>
-        </w:tc>
-        <w:tc>
-          <w:tcPr>
-            <w:tcW w:type="dxa" w:w="6768"/>
-            <w:shd w:fill="F8F9FA"/>
-          </w:tcPr>
-          <w:p>
-            <w:pPr>
-              <w:spacing w:after="0" w:before="0"/>
-            </w:pPr>
-            <w:r>
-              <w:rPr>
-                <w:color w:val="212529"/>
-                <w:sz w:val="16"/>
-              </w:rPr>
-            </w:r>
-          </w:p>
-        </w:tc>
-      </w:tr>
-      <w:tr>
-        <w:tc>
-          <w:tcPr>
-            <w:tcW w:type="dxa" w:w="2592"/>
-            <w:shd w:fill="F8F9FA"/>
-          </w:tcPr>
-          <w:p>
-            <w:pPr>
-              <w:spacing w:after="0" w:before="0"/>
-            </w:pPr>
-            <w:r>
-              <w:rPr>
-                <w:b/>
-                <w:color w:val="212529"/>
-                <w:sz w:val="16"/>
-              </w:rPr>
-              <w:t>License # / Licencia:</w:t>
-            </w:r>
-          </w:p>
-        </w:tc>
-        <w:tc>
-          <w:tcPr>
-            <w:tcW w:type="dxa" w:w="6768"/>
-            <w:shd w:fill="F8F9FA"/>
-          </w:tcPr>
-          <w:p>
-            <w:pPr>
-              <w:spacing w:after="0" w:before="0"/>
-            </w:pPr>
-            <w:r>
-              <w:rPr>
-                <w:color w:val="212529"/>
-                <w:sz w:val="16"/>
-              </w:rPr>
-            </w:r>
-          </w:p>
-        </w:tc>
-      </w:tr>
-      <w:tr>
-        <w:tc>
-          <w:tcPr>
-            <w:tcW w:type="dxa" w:w="2592"/>
-            <w:shd w:fill="F8F9FA"/>
-          </w:tcPr>
-          <w:p>
-            <w:pPr>
-              <w:spacing w:after="0" w:before="0"/>
-            </w:pPr>
-            <w:r>
-              <w:rPr>
-                <w:b/>
-                <w:color w:val="212529"/>
-                <w:sz w:val="16"/>
-              </w:rPr>
-              <w:t>Email / Correo:</w:t>
-            </w:r>
-          </w:p>
-        </w:tc>
-        <w:tc>
-          <w:tcPr>
-            <w:tcW w:type="dxa" w:w="6768"/>
-            <w:shd w:fill="F8F9FA"/>
-          </w:tcPr>
-          <w:p>
-            <w:pPr>
-              <w:spacing w:after="0" w:before="0"/>
-            </w:pPr>
-            <w:r>
-              <w:rPr>
-                <w:color w:val="212529"/>
-                <w:sz w:val="16"/>
-              </w:rPr>
-            </w:r>
-          </w:p>
-        </w:tc>
-      </w:tr>
-      <w:tr>
-        <w:tc>
-          <w:tcPr>
-            <w:tcW w:type="dxa" w:w="2592"/>
-            <w:shd w:fill="F8F9FA"/>
-          </w:tcPr>
-          <w:p>
-            <w:pPr>
-              <w:spacing w:after="0" w:before="0"/>
-            </w:pPr>
-            <w:r>
-              <w:rPr>
-                <w:b/>
-                <w:color w:val="212529"/>
-                <w:sz w:val="16"/>
-              </w:rPr>
-              <w:t>Phone / Teléfono:</w:t>
-            </w:r>
-          </w:p>
-        </w:tc>
-        <w:tc>
-          <w:tcPr>
-            <w:tcW w:type="dxa" w:w="6768"/>
-            <w:shd w:fill="F8F9FA"/>
-          </w:tcPr>
-          <w:p>
-            <w:pPr>
-              <w:spacing w:after="0" w:before="0"/>
-            </w:pPr>
-            <w:r>
-              <w:rPr>
-                <w:color w:val="212529"/>
-                <w:sz w:val="16"/>
-              </w:rPr>
-            </w:r>
-          </w:p>
-        </w:tc>
-      </w:tr>
-      <w:tr>
-        <w:tc>
-          <w:tcPr>
-            <w:tcW w:type="dxa" w:w="2592"/>
-            <w:shd w:fill="F8F9FA"/>
-          </w:tcPr>
-          <w:p>
-            <w:pPr>
-              <w:spacing w:after="0" w:before="0"/>
-            </w:pPr>
-            <w:r>
-              <w:rPr>
-                <w:b/>
-                <w:color w:val="212529"/>
-                <w:sz w:val="16"/>
-              </w:rPr>
-              <w:t>Brokerage / Agencia:</w:t>
-            </w:r>
-          </w:p>
-        </w:tc>
-        <w:tc>
-          <w:tcPr>
-            <w:tcW w:type="dxa" w:w="6768"/>
-            <w:shd w:fill="F8F9FA"/>
-          </w:tcPr>
-          <w:p>
-            <w:pPr>
-              <w:spacing w:after="0" w:before="0"/>
-            </w:pPr>
-            <w:r>
-              <w:rPr>
-                <w:color w:val="212529"/>
-                <w:sz w:val="16"/>
-              </w:rPr>
-            </w:r>
-          </w:p>
-        </w:tc>
-      </w:tr>
-    </w:tbl>
-    <w:p>
-      <w:pPr>
-        <w:spacing w:before="120" w:after="40"/>
-      </w:pPr>
-      <w:r>
-        <w:rPr>
-          <w:b/>
-          <w:color w:val="003DA5"/>
-          <w:sz w:val="18"/>
-        </w:rPr>
-        <w:t>Receiving Agent / Agente Receptor (Spain)</w:t>
-      </w:r>
-    </w:p>
-    <w:tbl>
-      <w:tblPr>
-        <w:tblW w:type="auto" w:w="0"/>
-        <w:tblLook w:firstColumn="1" w:firstRow="1" w:lastColumn="0" w:lastRow="0" w:noHBand="0" w:noVBand="1" w:val="04A0"/>
-      </w:tblPr>
-      <w:tblGrid>
-        <w:gridCol w:w="2592"/>
-        <w:gridCol w:w="6768"/>
-      </w:tblGrid>
-      <w:tr>
-        <w:tc>
-          <w:tcPr>
-            <w:tcW w:type="dxa" w:w="2592"/>
-            <w:shd w:fill="F8F9FA"/>
-          </w:tcPr>
-          <w:p>
-            <w:pPr>
-              <w:spacing w:after="0" w:before="0"/>
-            </w:pPr>
-            <w:r>
-              <w:rPr>
-                <w:b/>
-                <w:color w:val="212529"/>
-                <w:sz w:val="16"/>
-              </w:rPr>
-              <w:t>Name / Nombre:</w:t>
-            </w:r>
-          </w:p>
-        </w:tc>
-        <w:tc>
-          <w:tcPr>
-            <w:tcW w:type="dxa" w:w="6768"/>
-            <w:shd w:fill="F8F9FA"/>
-          </w:tcPr>
-          <w:p>
-            <w:pPr>
-              <w:spacing w:after="0" w:before="0"/>
-            </w:pPr>
-            <w:r>
-              <w:rPr>
-                <w:color w:val="212529"/>
-                <w:sz w:val="16"/>
-              </w:rPr>
-            </w:r>
-          </w:p>
-        </w:tc>
-      </w:tr>
-      <w:tr>
-        <w:tc>
-          <w:tcPr>
-            <w:tcW w:type="dxa" w:w="2592"/>
-            <w:shd w:fill="F8F9FA"/>
-          </w:tcPr>
-          <w:p>
-            <w:pPr>
-              <w:spacing w:after="0" w:before="0"/>
-            </w:pPr>
-            <w:r>
-              <w:rPr>
-                <w:b/>
-                <w:color w:val="212529"/>
-                <w:sz w:val="16"/>
-              </w:rPr>
-              <w:t>Email / Correo:</w:t>
-            </w:r>
-          </w:p>
-        </w:tc>
-        <w:tc>
-          <w:tcPr>
-            <w:tcW w:type="dxa" w:w="6768"/>
-            <w:shd w:fill="F8F9FA"/>
-          </w:tcPr>
-          <w:p>
-            <w:pPr>
-              <w:spacing w:after="0" w:before="0"/>
-            </w:pPr>
-            <w:r>
-              <w:rPr>
-                <w:color w:val="212529"/>
-                <w:sz w:val="16"/>
-              </w:rPr>
-            </w:r>
-          </w:p>
-        </w:tc>
-      </w:tr>
-      <w:tr>
-        <w:tc>
-          <w:tcPr>
-            <w:tcW w:type="dxa" w:w="2592"/>
-            <w:shd w:fill="F8F9FA"/>
-          </w:tcPr>
-          <w:p>
-            <w:pPr>
-              <w:spacing w:after="0" w:before="0"/>
-            </w:pPr>
-            <w:r>
-              <w:rPr>
-                <w:b/>
-                <w:color w:val="212529"/>
-                <w:sz w:val="16"/>
-              </w:rPr>
-              <w:t>Phone / Teléfono:</w:t>
-            </w:r>
-          </w:p>
-        </w:tc>
-        <w:tc>
-          <w:tcPr>
-            <w:tcW w:type="dxa" w:w="6768"/>
-            <w:shd w:fill="F8F9FA"/>
-          </w:tcPr>
-          <w:p>
-            <w:pPr>
-              <w:spacing w:after="0" w:before="0"/>
-            </w:pPr>
-            <w:r>
-              <w:rPr>
-                <w:color w:val="212529"/>
-                <w:sz w:val="16"/>
-              </w:rPr>
-            </w:r>
-          </w:p>
-        </w:tc>
-      </w:tr>
-      <w:tr>
-        <w:tc>
-          <w:tcPr>
-            <w:tcW w:type="dxa" w:w="2592"/>
-            <w:shd w:fill="F8F9FA"/>
-          </w:tcPr>
-          <w:p>
-            <w:pPr>
-              <w:spacing w:after="0" w:before="0"/>
-            </w:pPr>
-            <w:r>
-              <w:rPr>
-                <w:b/>
-                <w:color w:val="212529"/>
-                <w:sz w:val="16"/>
-              </w:rPr>
-              <w:t>Office / Oficina:</w:t>
-            </w:r>
-          </w:p>
-        </w:tc>
-        <w:tc>
-          <w:tcPr>
-            <w:tcW w:type="dxa" w:w="6768"/>
-            <w:shd w:fill="F8F9FA"/>
-          </w:tcPr>
-          <w:p>
-            <w:pPr>
-              <w:spacing w:after="0" w:before="0"/>
-            </w:pPr>
-            <w:r>
-              <w:rPr>
-                <w:color w:val="212529"/>
-                <w:sz w:val="16"/>
-              </w:rPr>
-              <w:t>RE/MAX Inmomás</w:t>
-            </w:r>
-          </w:p>
-        </w:tc>
-      </w:tr>
-    </w:tbl>
     <w:p>
       <w:pPr>
         <w:spacing w:before="120" w:after="40"/>

</xml_diff>